<commit_message>
docs(commercial): régénère .docx/.pdf des brochures mises à jour
Régénère via docs/_template/build.sh (pandoc 3.5 + Chrome headless) les 10
documents dont le .md a été corrigé (retrait SLA/pénalités, livraison 3h/6h) :
brochures entreprises 06-03 & 05-27, brochures/offres VTC 05 & 06-03,
brochure/offre BTP 05, et les deux études pricing (bandeau obsolète).

Co-Authored-By: Claude Opus 4.8 (1M context) <noreply@anthropic.com>
</commit_message>
<xml_diff>
--- a/docs/brochure-btp-grand-compte-2026-05.docx
+++ b/docs/brochure-btp-grand-compte-2026-05.docx
@@ -727,7 +727,7 @@
           <w:b/>
           <w:bCs/>
         </w:rPr>
-        <w:t xml:space="preserve">Livraison 3 h chrono à Abidjan</w:t>
+        <w:t xml:space="preserve">Livraison express à Abidjan : 3 heures, 6 heures maximum</w:t>
       </w:r>
       <w:r>
         <w:t xml:space="preserve"> </w:t>
@@ -749,7 +749,7 @@
           <w:b/>
           <w:bCs/>
         </w:rPr>
-        <w:t xml:space="preserve">Livraison J+1 garantie hors Abidjan</w:t>
+        <w:t xml:space="preserve">Livraison prioritaire hors Abidjan</w:t>
       </w:r>
       <w:r>
         <w:t xml:space="preserve"> </w:t>
@@ -772,28 +772,6 @@
       </w:r>
       <w:r>
         <w:t xml:space="preserve">: Tongon, Ity, Bonikro à la demande).</w:t>
-      </w:r>
-    </w:p>
-    <w:p>
-      <w:pPr>
-        <w:pStyle w:val="Compact"/>
-        <w:numPr>
-          <w:ilvl w:val="0"/>
-          <w:numId w:val="1007"/>
-        </w:numPr>
-      </w:pPr>
-      <w:r>
-        <w:rPr>
-          <w:b/>
-          <w:bCs/>
-        </w:rPr>
-        <w:t xml:space="preserve">SLA monétisé</w:t>
-      </w:r>
-      <w:r>
-        <w:t xml:space="preserve"> </w:t>
-      </w:r>
-      <w:r>
-        <w:t xml:space="preserve">: remboursement intégral des frais + 5 000 F de crédit en cas de breach.</w:t>
       </w:r>
     </w:p>
     <w:p>
@@ -1420,7 +1398,7 @@
         <w:t xml:space="preserve"> </w:t>
       </w:r>
       <w:r>
-        <w:t xml:space="preserve">: la valeur d'un jour d'immobilisation d'engin lourd justifie 10 fois le surcoût du SLA 3 h chrono.</w:t>
+        <w:t xml:space="preserve">: la valeur d'un jour d'immobilisation d'engin lourd justifie 10 fois le surcoût de la livraison express 3 h (6 h max).</w:t>
       </w:r>
     </w:p>
     <w:bookmarkEnd w:id="28"/>

</xml_diff>

<commit_message>
docs(commercial): régénère les documents de présentation au thème Pièces v2
Reconstruit les 12 documents de présentation commerciale (brochures, offres,
pitch deck, pitch partenariat, plan d'affaires, étude de marché) via le pipeline
_template/build.sh — logo Gloock, palette navy/orange, eyebrow mono, encadrés
hero, puces orange. Ajoute le PPTX du pitch deck.

Rendu Chrome headless (footer WeasyPrint non disponible sur ce poste).

Co-Authored-By: Claude Opus 4.8 (1M context) <noreply@anthropic.com>
</commit_message>
<xml_diff>
--- a/docs/brochure-btp-grand-compte-2026-05.docx
+++ b/docs/brochure-btp-grand-compte-2026-05.docx
@@ -2,7 +2,7 @@
 <file path=word/document.xml><?xml version="1.0" encoding="utf-8"?>
 <w:document xmlns:w="http://schemas.openxmlformats.org/wordprocessingml/2006/main" xmlns:m="http://schemas.openxmlformats.org/officeDocument/2006/math" xmlns:r="http://schemas.openxmlformats.org/officeDocument/2006/relationships" xmlns:o="urn:schemas-microsoft-com:office:office" xmlns:v="urn:schemas-microsoft-com:vml" xmlns:w10="urn:schemas-microsoft-com:office:word" xmlns:a="http://schemas.openxmlformats.org/drawingml/2006/main" xmlns:pic="http://schemas.openxmlformats.org/drawingml/2006/picture" xmlns:wp="http://schemas.openxmlformats.org/drawingml/2006/wordprocessingDrawing">
   <w:body>
-    <w:bookmarkStart w:id="32" w:name="Xb74e99cf95c9a4dbf41027ccd7eb504795f8491"/>
+    <w:bookmarkStart w:id="33" w:name="X1947e33962cc7b3d44e36509f9212df7912e2af"/>
     <w:p>
       <w:pPr>
         <w:pStyle w:val="Heading1"/>
@@ -20,7 +20,7 @@
           <w:i/>
           <w:iCs/>
         </w:rPr>
-        <w:t xml:space="preserve">Édition confidentielle · destinée à [Nom de l’entreprise BTP] · 27 mai 2026</w:t>
+        <w:t xml:space="preserve">Édition confidentielle · destinée à [Nom de l'entreprise BTP] · 27 mai 2026</w:t>
       </w:r>
     </w:p>
     <w:p>
@@ -44,7 +44,7 @@
         <w:t xml:space="preserve"> </w:t>
       </w:r>
       <w:r>
-        <w:t xml:space="preserve">en Côte d’Ivoire qui exploitent</w:t>
+        <w:t xml:space="preserve">en Côte d'Ivoire qui exploitent</w:t>
       </w:r>
       <w:r>
         <w:t xml:space="preserve"> </w:t>
@@ -60,7 +60,7 @@
         <w:t xml:space="preserve"> </w:t>
       </w:r>
       <w:r>
-        <w:t xml:space="preserve">(camions bennes, semi-remorques, engins lourds, pickups de chantier) et veulent reprendre le contrôle sur leur budget pièces, leur taux d’immobilisation chantier et leur conformité fiscale DGI.</w:t>
+        <w:t xml:space="preserve">(camions bennes, semi-remorques, engins lourds, pickups de chantier) et veulent reprendre le contrôle sur leur budget pièces, leur taux d'immobilisation chantier et leur conformité fiscale DGI.</w:t>
       </w:r>
     </w:p>
     <w:bookmarkStart w:id="20" w:name="le-problème-à-votre-échelle"/>
@@ -103,7 +103,7 @@
           <w:b/>
           <w:bCs/>
         </w:rPr>
-        <w:t xml:space="preserve">chaque jour d’immobilisation d’une pelle, d’une niveleuse ou d’un camion benne</w:t>
+        <w:t xml:space="preserve">chaque jour d'immobilisation d'une pelle, d'une niveleuse ou d'un camion benne</w:t>
       </w:r>
       <w:r>
         <w:t xml:space="preserve"> </w:t>
@@ -121,7 +121,7 @@
         </w:numPr>
       </w:pPr>
       <w:r>
-        <w:t xml:space="preserve">L’équipe associée au repos forcé (chauffeur, manœuvres, mécano)</w:t>
+        <w:t xml:space="preserve">L'équipe associée au repos forcé (chauffeur, manœuvres, mécano)</w:t>
       </w:r>
     </w:p>
     <w:p>
@@ -133,7 +133,7 @@
         </w:numPr>
       </w:pPr>
       <w:r>
-        <w:t xml:space="preserve">Des pénalités contractuelles sur les avancées de chantier (jusqu’à 0,5–1 % du montant du marché par jour de retard)</w:t>
+        <w:t xml:space="preserve">Des pénalités contractuelles sur les avancées de chantier (jusqu'à 0,5–1 % du montant du marché par jour de retard)</w:t>
       </w:r>
     </w:p>
     <w:p>
@@ -153,7 +153,7 @@
         <w:pStyle w:val="FirstParagraph"/>
       </w:pPr>
       <w:r>
-        <w:t xml:space="preserve">Le coût réel d’une journée d’immobilisation d’un engin lourd en chantier oscille entre</w:t>
+        <w:t xml:space="preserve">Le coût réel d'une journée d'immobilisation d'un engin lourd en chantier oscille entre</w:t>
       </w:r>
       <w:r>
         <w:t xml:space="preserve"> </w:t>
@@ -302,10 +302,10 @@
           <w:b/>
           <w:bCs/>
         </w:rPr>
-        <w:t xml:space="preserve">éviter 2 jours d’immobilisation par engin lourd et par an = 50 à 100 millions de FCFA d’opex récupérés</w:t>
-      </w:r>
-      <w:r>
-        <w:t xml:space="preserve">. Et c’est avant de compter les pénalités contractuelles évitées.</w:t>
+        <w:t xml:space="preserve">éviter 2 jours d'immobilisation par engin lourd et par an = 50 à 100 millions de FCFA d'opex récupérés</w:t>
+      </w:r>
+      <w:r>
+        <w:t xml:space="preserve">. Et c'est avant de compter les pénalités contractuelles évitées.</w:t>
       </w:r>
     </w:p>
     <w:bookmarkEnd w:id="20"/>
@@ -318,7 +318,7 @@
         <w:t xml:space="preserve">Ce que Pièces apporte à votre échelle</w:t>
       </w:r>
     </w:p>
-    <w:bookmarkStart w:id="21" w:name="Xbf12c62684481f5e8e77fd17bcf227a2d90a1f0"/>
+    <w:bookmarkStart w:id="21" w:name="X5fe7cc502484e6d7e85e2703180326e9ea2f642"/>
     <w:p>
       <w:pPr>
         <w:pStyle w:val="Heading3"/>
@@ -400,7 +400,7 @@
       </w:r>
     </w:p>
     <w:bookmarkEnd w:id="21"/>
-    <w:bookmarkStart w:id="22" w:name="pilotage-de-flotte-multi-chantiers"/>
+    <w:bookmarkStart w:id="22" w:name="Xfa8df42df6b6a9c6d6c3aa45344a565d129244e"/>
     <w:p>
       <w:pPr>
         <w:pStyle w:val="Heading3"/>
@@ -498,7 +498,7 @@
       </w:r>
     </w:p>
     <w:bookmarkEnd w:id="22"/>
-    <w:bookmarkStart w:id="23" w:name="X250c28a31cda89a5ee44a0a21eab6907362110e"/>
+    <w:bookmarkStart w:id="23" w:name="X8ae415fae3c734c2cb465899e1544fb73b69d5c"/>
     <w:p>
       <w:pPr>
         <w:pStyle w:val="Heading3"/>
@@ -548,7 +548,7 @@
         <w:t xml:space="preserve"> </w:t>
       </w:r>
       <w:r>
-        <w:t xml:space="preserve">: Pièces préreserve chez ses partenaires les SKU critiques sur vos engins prioritaires (vidange Komatsu, filtres Caterpillar, plaquettes camions Volvo). Plus jamais de chantier à l’arrêt sur une référence courante.</w:t>
+        <w:t xml:space="preserve">: Pièces préreserve chez ses partenaires les SKU critiques sur vos engins prioritaires (vidange Komatsu, filtres Caterpillar, plaquettes camions Volvo). Plus jamais de chantier à l'arrêt sur une référence courante.</w:t>
       </w:r>
     </w:p>
     <w:p>
@@ -574,7 +574,7 @@
       </w:r>
     </w:p>
     <w:bookmarkEnd w:id="23"/>
-    <w:bookmarkStart w:id="24" w:name="conformité-fiscale-dgi-à-grande-échelle"/>
+    <w:bookmarkStart w:id="24" w:name="X7727fd01a5d8dfd6f5c27773b5a71d12fd71358"/>
     <w:p>
       <w:pPr>
         <w:pStyle w:val="Heading3"/>
@@ -690,14 +690,14 @@
           <w:b/>
           <w:bCs/>
         </w:rPr>
-        <w:t xml:space="preserve">1 à 2 % d’économie d’impôt sur le budget pièces annuel = 3 à 8 M FCFA récupérés</w:t>
+        <w:t xml:space="preserve">1 à 2 % d'économie d'impôt sur le budget pièces annuel = 3 à 8 M FCFA récupérés</w:t>
       </w:r>
       <w:r>
         <w:t xml:space="preserve">.</w:t>
       </w:r>
     </w:p>
     <w:bookmarkEnd w:id="24"/>
-    <w:bookmarkStart w:id="25" w:name="couche-urgence-chantier-flotte-pro"/>
+    <w:bookmarkStart w:id="25" w:name="Xa59329fd79ba091c5dab4ae23e16a426ed677a7"/>
     <w:p>
       <w:pPr>
         <w:pStyle w:val="Heading3"/>
@@ -711,7 +711,7 @@
         <w:pStyle w:val="FirstParagraph"/>
       </w:pPr>
       <w:r>
-        <w:t xml:space="preserve">Pour les engins sur lesquels une journée d’immobilisation coûte 200 à 500 000 FCFA :</w:t>
+        <w:t xml:space="preserve">Pour les engins sur lesquels une journée d'immobilisation coûte 200 à 500 000 FCFA :</w:t>
       </w:r>
     </w:p>
     <w:p>
@@ -837,11 +837,11 @@
         <w:t xml:space="preserve"> </w:t>
       </w:r>
       <w:r>
-        <w:t xml:space="preserve">: appel direct, Pièces source la pièce (même hors catalogue, même import express depuis la France ou Dubaï pour les références rares engins lourds) et l’achemine au chantier.</w:t>
+        <w:t xml:space="preserve">: appel direct, Pièces source la pièce (même hors catalogue, même import express depuis la France ou Dubaï pour les références rares engins lourds) et l'achemine au chantier.</w:t>
       </w:r>
     </w:p>
     <w:bookmarkEnd w:id="25"/>
-    <w:bookmarkStart w:id="26" w:name="intégration-outils-existants"/>
+    <w:bookmarkStart w:id="26" w:name="Xbd289c541f9bb9a950e8fd9df633b25617dc010"/>
     <w:p>
       <w:pPr>
         <w:pStyle w:val="Heading3"/>
@@ -895,7 +895,7 @@
         </w:numPr>
       </w:pPr>
       <w:r>
-        <w:t xml:space="preserve">Webhooks d’événements (commande passée, livrée, retournée)</w:t>
+        <w:t xml:space="preserve">Webhooks d'événements (commande passée, livrée, retournée)</w:t>
       </w:r>
     </w:p>
     <w:bookmarkEnd w:id="26"/>
@@ -906,7 +906,7 @@
         <w:pStyle w:val="Heading2"/>
       </w:pPr>
       <w:r>
-        <w:t xml:space="preserve">L’économie projetée pour 800 véhicules BTP</w:t>
+        <w:t xml:space="preserve">L'économie projetée pour 800 véhicules BTP</w:t>
       </w:r>
     </w:p>
     <w:p>
@@ -920,8 +920,7 @@
     <w:tbl>
       <w:tblPr>
         <w:tblStyle w:val="Table"/>
-        <w:tblW w:type="pct" w:w="5000"/>
-        <w:tblLayout w:type="fixed"/>
+        <w:tblW w:type="auto" w:w="0"/>
         <w:tblLook w:firstRow="1" w:lastRow="0" w:firstColumn="0" w:lastColumn="0" w:noHBand="0" w:noVBand="0" w:val="0020"/>
       </w:tblPr>
       <w:tblGrid>
@@ -1167,8 +1166,7 @@
     <w:tbl>
       <w:tblPr>
         <w:tblStyle w:val="Table"/>
-        <w:tblW w:type="pct" w:w="5000"/>
-        <w:tblLayout w:type="fixed"/>
+        <w:tblW w:type="auto" w:w="0"/>
         <w:tblLook w:firstRow="1" w:lastRow="0" w:firstColumn="0" w:lastColumn="0" w:noHBand="0" w:noVBand="0" w:val="0020"/>
       </w:tblPr>
       <w:tblGrid>
@@ -1334,15 +1332,15 @@
       <w:r>
         <w:t xml:space="preserve">ROI net projeté :</w:t>
       </w:r>
-      <w:r>
-        <w:t xml:space="preserve"> </w:t>
-      </w:r>
-      <w:r>
-        <w:t xml:space="preserve">-</w:t>
-      </w:r>
-      <w:r>
-        <w:t xml:space="preserve"> </w:t>
-      </w:r>
+    </w:p>
+    <w:p>
+      <w:pPr>
+        <w:pStyle w:val="Compact"/>
+        <w:numPr>
+          <w:ilvl w:val="0"/>
+          <w:numId w:val="1009"/>
+        </w:numPr>
+      </w:pPr>
       <w:r>
         <w:rPr>
           <w:b/>
@@ -1356,15 +1354,15 @@
       <w:r>
         <w:t xml:space="preserve">: +165 à +199 M FCFA/an (ROI ×5,1 à ×6,0)</w:t>
       </w:r>
-      <w:r>
-        <w:t xml:space="preserve"> </w:t>
-      </w:r>
-      <w:r>
-        <w:t xml:space="preserve">-</w:t>
-      </w:r>
-      <w:r>
-        <w:t xml:space="preserve"> </w:t>
-      </w:r>
+    </w:p>
+    <w:p>
+      <w:pPr>
+        <w:pStyle w:val="Compact"/>
+        <w:numPr>
+          <w:ilvl w:val="0"/>
+          <w:numId w:val="1009"/>
+        </w:numPr>
+      </w:pPr>
       <w:r>
         <w:rPr>
           <w:b/>
@@ -1376,15 +1374,15 @@
         <w:t xml:space="preserve"> </w:t>
       </w:r>
       <w:r>
-        <w:t xml:space="preserve">: +125 à +159 M FCFA/an (ROI ×2,6 à ×3,0) — le surcoût du tier + est largement couvert par l’économie d’immobilisation chantier (les pénalités contractuelles évitées ne sont pas comptabilisées dans le tableau, elles s’ajoutent).</w:t>
-      </w:r>
-    </w:p>
-    <w:p>
-      <w:pPr>
-        <w:pStyle w:val="BodyText"/>
-      </w:pPr>
-      <w:r>
-        <w:t xml:space="preserve">À l’échelle BTP,</w:t>
+        <w:t xml:space="preserve">: +125 à +159 M FCFA/an (ROI ×2,6 à ×3,0) — le surcoût du tier + est largement couvert par l'économie d'immobilisation chantier (les pénalités contractuelles évitées ne sont pas comptabilisées dans le tableau, elles s'ajoutent).</w:t>
+      </w:r>
+    </w:p>
+    <w:p>
+      <w:pPr>
+        <w:pStyle w:val="FirstParagraph"/>
+      </w:pPr>
+      <w:r>
+        <w:t xml:space="preserve">À l'échelle BTP,</w:t>
       </w:r>
       <w:r>
         <w:t xml:space="preserve"> </w:t>
@@ -1400,7 +1398,7 @@
         <w:t xml:space="preserve"> </w:t>
       </w:r>
       <w:r>
-        <w:t xml:space="preserve">: la valeur d’un jour d’immobilisation d’engin lourd justifie 10 fois le surcoût de la livraison express prioritaire.</w:t>
+        <w:t xml:space="preserve">: la valeur d'un jour d'immobilisation d'engin lourd justifie 10 fois le surcoût de la livraison express prioritaire.</w:t>
       </w:r>
     </w:p>
     <w:bookmarkEnd w:id="28"/>
@@ -1418,7 +1416,7 @@
         <w:pStyle w:val="Compact"/>
         <w:numPr>
           <w:ilvl w:val="0"/>
-          <w:numId w:val="1009"/>
+          <w:numId w:val="1010"/>
         </w:numPr>
       </w:pPr>
       <w:r>
@@ -1438,15 +1436,15 @@
         <w:t xml:space="preserve"> </w:t>
       </w:r>
       <w:r>
-        <w:t xml:space="preserve">— accès direct à l’équipe produit, priorisation des features engins lourds que vous demanderez, conditions de lancement préférentielles sur le contrat-cadre.</w:t>
-      </w:r>
-    </w:p>
-    <w:p>
-      <w:pPr>
-        <w:pStyle w:val="Compact"/>
-        <w:numPr>
-          <w:ilvl w:val="0"/>
-          <w:numId w:val="1009"/>
+        <w:t xml:space="preserve">— accès direct à l'équipe produit, priorisation des features engins lourds que vous demanderez, conditions de lancement préférentielles sur le contrat-cadre.</w:t>
+      </w:r>
+    </w:p>
+    <w:p>
+      <w:pPr>
+        <w:pStyle w:val="Compact"/>
+        <w:numPr>
+          <w:ilvl w:val="0"/>
+          <w:numId w:val="1010"/>
         </w:numPr>
       </w:pPr>
       <w:r>
@@ -1466,15 +1464,15 @@
         <w:t xml:space="preserve"> </w:t>
       </w:r>
       <w:r>
-        <w:t xml:space="preserve">s’applique : si à 3 mois Flotte Pro n’a pas fait économiser au moins l’équivalent de l’abonnement, Pièces rembourse la dernière mensualité et le contrat est résiliable sans pénalité.</w:t>
-      </w:r>
-    </w:p>
-    <w:p>
-      <w:pPr>
-        <w:pStyle w:val="Compact"/>
-        <w:numPr>
-          <w:ilvl w:val="0"/>
-          <w:numId w:val="1009"/>
+        <w:t xml:space="preserve">s'applique : si à 3 mois Flotte Pro n'a pas fait économiser au moins l'équivalent de l'abonnement, Pièces rembourse la dernière mensualité et le contrat est résiliable sans pénalité.</w:t>
+      </w:r>
+    </w:p>
+    <w:p>
+      <w:pPr>
+        <w:pStyle w:val="Compact"/>
+        <w:numPr>
+          <w:ilvl w:val="0"/>
+          <w:numId w:val="1010"/>
         </w:numPr>
       </w:pPr>
       <w:r>
@@ -1496,7 +1494,7 @@
         <w:pStyle w:val="Compact"/>
         <w:numPr>
           <w:ilvl w:val="0"/>
-          <w:numId w:val="1010"/>
+          <w:numId w:val="1011"/>
         </w:numPr>
       </w:pPr>
       <w:r>
@@ -1518,7 +1516,7 @@
         <w:pStyle w:val="Compact"/>
         <w:numPr>
           <w:ilvl w:val="0"/>
-          <w:numId w:val="1010"/>
+          <w:numId w:val="1011"/>
         </w:numPr>
       </w:pPr>
       <w:r>
@@ -1540,7 +1538,7 @@
         <w:pStyle w:val="Compact"/>
         <w:numPr>
           <w:ilvl w:val="0"/>
-          <w:numId w:val="1010"/>
+          <w:numId w:val="1011"/>
         </w:numPr>
       </w:pPr>
       <w:r>
@@ -1562,7 +1560,7 @@
         <w:pStyle w:val="Compact"/>
         <w:numPr>
           <w:ilvl w:val="0"/>
-          <w:numId w:val="1010"/>
+          <w:numId w:val="1011"/>
         </w:numPr>
       </w:pPr>
       <w:r>
@@ -1576,11 +1574,11 @@
         <w:t xml:space="preserve"> </w:t>
       </w:r>
       <w:r>
-        <w:t xml:space="preserve">sur l’ensemble du parc — un Liaison senior dédié, intégration GMAO, formation des chefs de chantier, mise en place stock tampon SKU critiques.</w:t>
+        <w:t xml:space="preserve">sur l'ensemble du parc — un Liaison senior dédié, intégration GMAO, formation des chefs de chantier, mise en place stock tampon SKU critiques.</w:t>
       </w:r>
     </w:p>
     <w:bookmarkEnd w:id="30"/>
-    <w:bookmarkStart w:id="31" w:name="contact"/>
+    <w:bookmarkStart w:id="32" w:name="contact"/>
     <w:p>
       <w:pPr>
         <w:pStyle w:val="Heading2"/>
@@ -1609,9 +1607,14 @@
       <w:r>
         <w:t xml:space="preserve"> </w:t>
       </w:r>
-      <w:r>
-        <w:t xml:space="preserve">fernando.kouame@gmail.com</w:t>
-      </w:r>
+      <w:hyperlink r:id="rId31">
+        <w:r>
+          <w:rPr>
+            <w:rStyle w:val="Hyperlink"/>
+          </w:rPr>
+          <w:t xml:space="preserve">fernando.kouame@gmail.com</w:t>
+        </w:r>
+      </w:hyperlink>
     </w:p>
     <w:p>
       <w:pPr>
@@ -1622,11 +1625,11 @@
           <w:i/>
           <w:iCs/>
         </w:rPr>
-        <w:t xml:space="preserve">Ce document est confidentiel et destiné exclusivement à [Nom de l’entreprise BTP]. Les projections sont indicatives et fondées sur des hypothèses prudentes pour un mix BTP standard ; l’offre commerciale finale sera adaptée après audit du parc et identification des engins prioritaires.</w:t>
-      </w:r>
-    </w:p>
-    <w:bookmarkEnd w:id="31"/>
+        <w:t xml:space="preserve">Ce document est confidentiel et destiné exclusivement à [Nom de l'entreprise BTP]. Les projections sont indicatives et fondées sur des hypothèses prudentes pour un mix BTP standard ; l'offre commerciale finale sera adaptée après audit du parc et identification des engins prioritaires.</w:t>
+      </w:r>
+    </w:p>
     <w:bookmarkEnd w:id="32"/>
+    <w:bookmarkEnd w:id="33"/>
     <w:sectPr/>
   </w:body>
 </w:document>
@@ -1952,6 +1955,9 @@
     <w:abstractNumId w:val="991"/>
   </w:num>
   <w:num w:numId="1010">
+    <w:abstractNumId w:val="991"/>
+  </w:num>
+  <w:num w:numId="1011">
     <w:abstractNumId w:val="99411"/>
     <w:lvlOverride w:ilvl="0">
       <w:startOverride w:val="1"/>

</xml_diff>